<commit_message>
ret visualisering og rapport designdiagram
</commit_message>
<xml_diff>
--- a/testrapporter/Dimensionering - Mit lille projekt - 2026-06-03.docx
+++ b/testrapporter/Dimensionering - Mit lille projekt - 2026-06-03.docx
@@ -233,15 +233,9 @@
           <w:sz w:val="22"/>
           <w:szCs w:val="22"/>
         </w:rPr>
-        <w:t xml:space="preserve">   • Dimensionsgivende trafikbelastning: T6</w:t>
+        <w:t xml:space="preserve">Dimensionsgivende trafikbelastning: T5, svarende til belastningsklasse 5.</w:t>
         <w:br/>
-        <w:t xml:space="preserve">   • Vingestyrke, Cv, skønnet i planum: &gt; 100 kPa</w:t>
-        <w:br/>
-        <w:t xml:space="preserve">   • Grundvandsspejl: ikke oplyst/ikke relevant</w:t>
-        <w:br/>
-        <w:t xml:space="preserve">   • Bærelagsmaterialer:</w:t>
-        <w:br/>
-        <w:t xml:space="preserve">           o Genbrugsstabil</w:t>
+        <w:t xml:space="preserve">Eu i planum forudsættes til 10 MPa.</w:t>
       </w:r>
       <w:r>
         <w:rPr>
@@ -1472,7 +1466,7 @@
                 <w:szCs w:val="22"/>
                 <w:lang w:val="en-US"/>
               </w:rPr>
-              <w:t xml:space="preserve">GS-GRID SX170</w:t>
+              <w:t xml:space="preserve">Tensar InterAx NX750</w:t>
             </w:r>
             <w:r>
               <w:rPr>
@@ -2276,7 +2270,7 @@
       <w:r>
         <w:drawing>
           <wp:inline xmlns:a="http://schemas.openxmlformats.org/drawingml/2006/main" xmlns:pic="http://schemas.openxmlformats.org/drawingml/2006/picture">
-            <wp:extent cx="5760000" cy="1926219"/>
+            <wp:extent cx="5760000" cy="1915362"/>
             <wp:docPr id="1001" name="Picture 1"/>
             <wp:cNvGraphicFramePr>
               <a:graphicFrameLocks noChangeAspect="1"/>
@@ -2297,7 +2291,7 @@
                   <pic:spPr>
                     <a:xfrm>
                       <a:off x="0" y="0"/>
-                      <a:ext cx="5760000" cy="1926219"/>
+                      <a:ext cx="5760000" cy="1915362"/>
                     </a:xfrm>
                     <a:prstGeom prst="rect"/>
                   </pic:spPr>
@@ -2921,7 +2915,7 @@
           <w:sz w:val="22"/>
           <w:szCs w:val="22"/>
         </w:rPr>
-        <w:t xml:space="preserve">04/06/2026</w:t>
+        <w:t xml:space="preserve">05/06/2026</w:t>
       </w:r>
       <w:r>
         <w:rPr>

</xml_diff>